<commit_message>
Align teaching pack reuse notes with verified final films
</commit_message>
<xml_diff>
--- a/project/courses/ai-engineering/reuse-note.docx
+++ b/project/courses/ai-engineering/reuse-note.docx
@@ -8,7 +8,7 @@
         <w:jc w:val="center"/>
       </w:pPr>
       <w:r>
-        <w:t>既有说课片与本资源包关联核对</w:t>
+        <w:t>既有说课片与本资源包关联核对（最终交付版）</w:t>
       </w:r>
     </w:p>
     <w:p>
@@ -16,7 +16,459 @@
         <w:jc w:val="both"/>
       </w:pPr>
       <w:r>
-        <w:t>核对时间：2026-10-10T18:35:17。仅只读关联项目目录，未修改其素材、音频、分镜或成片。</w:t>
+        <w:t>本说明于2026年10月10日按实际最终成片更新，替代准备阶段的“成片待完成”和“AI定位待修订”状态。六门课程均已形成600秒Spark本人克隆声音lecture说课片，附字幕、完整教学设计、四个案例及认定审核空表。技术验收不替代课程正式认定或真实教学实施。</w:t>
+      </w:r>
+    </w:p>
+    <w:p>
+      <w:pPr>
+        <w:pStyle w:val="Heading1"/>
+      </w:pPr>
+      <w:r>
+        <w:t>一、六门课程逐一关联</w:t>
+      </w:r>
+    </w:p>
+    <w:tbl>
+      <w:tblPr>
+        <w:tblStyle w:val="LightShading-Accent1"/>
+        <w:tblW w:type="auto" w:w="0"/>
+        <w:tblLook w:firstColumn="1" w:firstRow="1" w:lastColumn="0" w:lastRow="0" w:noHBand="0" w:noVBand="1" w:val="04A0"/>
+      </w:tblPr>
+      <w:tblGrid>
+        <w:gridCol w:w="3009"/>
+        <w:gridCol w:w="3009"/>
+        <w:gridCol w:w="3009"/>
+      </w:tblGrid>
+      <w:tr>
+        <w:trPr>
+          <w:tblHeader/>
+        </w:trPr>
+        <w:tc>
+          <w:tcPr>
+            <w:tcW w:type="dxa" w:w="3009"/>
+          </w:tcPr>
+          <w:p>
+            <w:pPr>
+              <w:spacing w:after="60"/>
+              <w:ind w:firstLine="0"/>
+            </w:pPr>
+            <w:r>
+              <w:rPr>
+                <w:rFonts w:ascii="Calibri" w:hAnsi="Calibri" w:eastAsia="SimSun"/>
+                <w:sz w:val="21"/>
+                <w14:textOutline w14:w="1905" w14:cap="flat" w14:cmpd="sng" w14:algn="ctr">
+                  <w14:solidFill>
+                    <w14:srgbClr w14:val="202B3A"/>
+                  </w14:solidFill>
+                  <w14:prstDash w14:val="solid"/>
+                  <w14:round/>
+                </w14:textOutline>
+              </w:rPr>
+              <w:t>课程</w:t>
+            </w:r>
+          </w:p>
+        </w:tc>
+        <w:tc>
+          <w:tcPr>
+            <w:tcW w:type="dxa" w:w="3009"/>
+          </w:tcPr>
+          <w:p>
+            <w:pPr>
+              <w:spacing w:after="60"/>
+              <w:ind w:firstLine="0"/>
+            </w:pPr>
+            <w:r>
+              <w:rPr>
+                <w:rFonts w:ascii="Calibri" w:hAnsi="Calibri" w:eastAsia="SimSun"/>
+                <w:sz w:val="21"/>
+                <w14:textOutline w14:w="1905" w14:cap="flat" w14:cmpd="sng" w14:algn="ctr">
+                  <w14:solidFill>
+                    <w14:srgbClr w14:val="202B3A"/>
+                  </w14:solidFill>
+                  <w14:prstDash w14:val="solid"/>
+                  <w14:round/>
+                </w14:textOutline>
+              </w:rPr>
+              <w:t>影片与90分钟课堂设计的区别</w:t>
+            </w:r>
+          </w:p>
+        </w:tc>
+        <w:tc>
+          <w:tcPr>
+            <w:tcW w:type="dxa" w:w="3009"/>
+          </w:tcPr>
+          <w:p>
+            <w:pPr>
+              <w:spacing w:after="60"/>
+              <w:ind w:firstLine="0"/>
+            </w:pPr>
+            <w:r>
+              <w:rPr>
+                <w:rFonts w:ascii="Calibri" w:hAnsi="Calibri" w:eastAsia="SimSun"/>
+                <w:sz w:val="21"/>
+                <w14:textOutline w14:w="1905" w14:cap="flat" w14:cmpd="sng" w14:algn="ctr">
+                  <w14:solidFill>
+                    <w14:srgbClr w14:val="202B3A"/>
+                  </w14:solidFill>
+                  <w14:prstDash w14:val="solid"/>
+                  <w14:round/>
+                </w14:textOutline>
+              </w:rPr>
+              <w:t>最终采用结论</w:t>
+            </w:r>
+          </w:p>
+        </w:tc>
+      </w:tr>
+      <w:tr>
+        <w:tc>
+          <w:tcPr>
+            <w:tcW w:type="dxa" w:w="3009"/>
+          </w:tcPr>
+          <w:p>
+            <w:pPr>
+              <w:spacing w:after="60"/>
+              <w:ind w:firstLine="0"/>
+            </w:pPr>
+            <w:r>
+              <w:rPr>
+                <w:rFonts w:ascii="Calibri" w:hAnsi="Calibri" w:eastAsia="SimSun"/>
+                <w:sz w:val="21"/>
+              </w:rPr>
+              <w:t>离散数学</w:t>
+            </w:r>
+          </w:p>
+        </w:tc>
+        <w:tc>
+          <w:tcPr>
+            <w:tcW w:type="dxa" w:w="3009"/>
+          </w:tcPr>
+          <w:p>
+            <w:pPr>
+              <w:spacing w:after="60"/>
+              <w:ind w:firstLine="0"/>
+            </w:pPr>
+            <w:r>
+              <w:rPr>
+                <w:rFonts w:ascii="Calibri" w:hAnsi="Calibri" w:eastAsia="SimSun"/>
+                <w:sz w:val="21"/>
+              </w:rPr>
+              <w:t>本包典型课为90分钟的合成联系图与广度优先搜索，不与欧拉逐边遍历混写；影片文化遗产案例是原稿补充案例，不计入本包四例。</w:t>
+            </w:r>
+          </w:p>
+        </w:tc>
+        <w:tc>
+          <w:tcPr>
+            <w:tcW w:type="dxa" w:w="3009"/>
+          </w:tcPr>
+          <w:p>
+            <w:pPr>
+              <w:spacing w:after="60"/>
+              <w:ind w:firstLine="0"/>
+            </w:pPr>
+            <w:r>
+              <w:rPr>
+                <w:rFonts w:ascii="Calibri" w:hAnsi="Calibri" w:eastAsia="SimSun"/>
+                <w:sz w:val="21"/>
+              </w:rPr>
+              <w:t>知识、能力和价值目标与本包一致，可作课程说课与原稿补充示例；须随片附本说明和新增量规。</w:t>
+            </w:r>
+          </w:p>
+        </w:tc>
+      </w:tr>
+      <w:tr>
+        <w:tc>
+          <w:tcPr>
+            <w:tcW w:type="dxa" w:w="3009"/>
+          </w:tcPr>
+          <w:p>
+            <w:pPr>
+              <w:spacing w:after="60"/>
+              <w:ind w:firstLine="0"/>
+            </w:pPr>
+            <w:r>
+              <w:rPr>
+                <w:rFonts w:ascii="Calibri" w:hAnsi="Calibri" w:eastAsia="SimSun"/>
+                <w:sz w:val="21"/>
+              </w:rPr>
+              <w:t>C语言程序设计</w:t>
+            </w:r>
+          </w:p>
+        </w:tc>
+        <w:tc>
+          <w:tcPr>
+            <w:tcW w:type="dxa" w:w="3009"/>
+          </w:tcPr>
+          <w:p>
+            <w:pPr>
+              <w:spacing w:after="60"/>
+              <w:ind w:firstLine="0"/>
+            </w:pPr>
+            <w:r>
+              <w:rPr>
+                <w:rFonts w:ascii="Calibri" w:hAnsi="Calibri" w:eastAsia="SimSun"/>
+                <w:sz w:val="21"/>
+              </w:rPr>
+              <w:t>本包典型课为90分钟字符串边界与输入检查；影片动态内存示例对应本包案例二，二者分别覆盖数组边界与生命周期。</w:t>
+            </w:r>
+          </w:p>
+        </w:tc>
+        <w:tc>
+          <w:tcPr>
+            <w:tcW w:type="dxa" w:w="3009"/>
+          </w:tcPr>
+          <w:p>
+            <w:pPr>
+              <w:spacing w:after="60"/>
+              <w:ind w:firstLine="0"/>
+            </w:pPr>
+            <w:r>
+              <w:rPr>
+                <w:rFonts w:ascii="Calibri" w:hAnsi="Calibri" w:eastAsia="SimSun"/>
+                <w:sz w:val="21"/>
+              </w:rPr>
+              <w:t>可作为本包课程说课，动态内存案例直接关联；须附本包100分量规和90分钟示例课说明。</w:t>
+            </w:r>
+          </w:p>
+        </w:tc>
+      </w:tr>
+      <w:tr>
+        <w:tc>
+          <w:tcPr>
+            <w:tcW w:type="dxa" w:w="3009"/>
+          </w:tcPr>
+          <w:p>
+            <w:pPr>
+              <w:spacing w:after="60"/>
+              <w:ind w:firstLine="0"/>
+            </w:pPr>
+            <w:r>
+              <w:rPr>
+                <w:rFonts w:ascii="Calibri" w:hAnsi="Calibri" w:eastAsia="SimSun"/>
+                <w:sz w:val="21"/>
+              </w:rPr>
+              <w:t>网络安全技术</w:t>
+            </w:r>
+          </w:p>
+        </w:tc>
+        <w:tc>
+          <w:tcPr>
+            <w:tcW w:type="dxa" w:w="3009"/>
+          </w:tcPr>
+          <w:p>
+            <w:pPr>
+              <w:spacing w:after="60"/>
+              <w:ind w:firstLine="0"/>
+            </w:pPr>
+            <w:r>
+              <w:rPr>
+                <w:rFonts w:ascii="Calibri" w:hAnsi="Calibri" w:eastAsia="SimSun"/>
+                <w:sz w:val="21"/>
+              </w:rPr>
+              <w:t>本包典型课为90分钟虚构预约服务的纵深防御评审，细化权限矩阵、允许/拒绝验证、恢复和残余风险。</w:t>
+            </w:r>
+          </w:p>
+        </w:tc>
+        <w:tc>
+          <w:tcPr>
+            <w:tcW w:type="dxa" w:w="3009"/>
+          </w:tcPr>
+          <w:p>
+            <w:pPr>
+              <w:spacing w:after="60"/>
+              <w:ind w:firstLine="0"/>
+            </w:pPr>
+            <w:r>
+              <w:rPr>
+                <w:rFonts w:ascii="Calibri" w:hAnsi="Calibri" w:eastAsia="SimSun"/>
+                <w:sz w:val="21"/>
+              </w:rPr>
+              <w:t>可作为本包课程说课，影片案例直接对应案例四；新增量规和授权范围另附，不将影片片段写成完整90分钟课。</w:t>
+            </w:r>
+          </w:p>
+        </w:tc>
+      </w:tr>
+      <w:tr>
+        <w:tc>
+          <w:tcPr>
+            <w:tcW w:type="dxa" w:w="3009"/>
+          </w:tcPr>
+          <w:p>
+            <w:pPr>
+              <w:spacing w:after="60"/>
+              <w:ind w:firstLine="0"/>
+            </w:pPr>
+            <w:r>
+              <w:rPr>
+                <w:rFonts w:ascii="Calibri" w:hAnsi="Calibri" w:eastAsia="SimSun"/>
+                <w:sz w:val="21"/>
+              </w:rPr>
+              <w:t>嵌入式系统</w:t>
+            </w:r>
+          </w:p>
+        </w:tc>
+        <w:tc>
+          <w:tcPr>
+            <w:tcW w:type="dxa" w:w="3009"/>
+          </w:tcPr>
+          <w:p>
+            <w:pPr>
+              <w:spacing w:after="60"/>
+              <w:ind w:firstLine="0"/>
+            </w:pPr>
+            <w:r>
+              <w:rPr>
+                <w:rFonts w:ascii="Calibri" w:hAnsi="Calibri" w:eastAsia="SimSun"/>
+                <w:sz w:val="21"/>
+              </w:rPr>
+              <w:t>本包典型课为90分钟虚拟灌溉状态机和故障安全；影片强调驱动输入、权限与中断处理，对应案例一及接口安全学习，不代替本包控制状态机测试。</w:t>
+            </w:r>
+          </w:p>
+        </w:tc>
+        <w:tc>
+          <w:tcPr>
+            <w:tcW w:type="dxa" w:w="3009"/>
+          </w:tcPr>
+          <w:p>
+            <w:pPr>
+              <w:spacing w:after="60"/>
+              <w:ind w:firstLine="0"/>
+            </w:pPr>
+            <w:r>
+              <w:rPr>
+                <w:rFonts w:ascii="Calibri" w:hAnsi="Calibri" w:eastAsia="SimSun"/>
+                <w:sz w:val="21"/>
+              </w:rPr>
+              <w:t>可作为课程说课和驱动安全补充示例；须保留本包实时、状态机及故障证据要求，正式大纲确认时与原Linux/ARM章节核对。</w:t>
+            </w:r>
+          </w:p>
+        </w:tc>
+      </w:tr>
+      <w:tr>
+        <w:tc>
+          <w:tcPr>
+            <w:tcW w:type="dxa" w:w="3009"/>
+          </w:tcPr>
+          <w:p>
+            <w:pPr>
+              <w:spacing w:after="60"/>
+              <w:ind w:firstLine="0"/>
+            </w:pPr>
+            <w:r>
+              <w:rPr>
+                <w:rFonts w:ascii="Calibri" w:hAnsi="Calibri" w:eastAsia="SimSun"/>
+                <w:sz w:val="21"/>
+              </w:rPr>
+              <w:t>数据挖掘</w:t>
+            </w:r>
+          </w:p>
+        </w:tc>
+        <w:tc>
+          <w:tcPr>
+            <w:tcW w:type="dxa" w:w="3009"/>
+          </w:tcPr>
+          <w:p>
+            <w:pPr>
+              <w:spacing w:after="60"/>
+              <w:ind w:firstLine="0"/>
+            </w:pPr>
+            <w:r>
+              <w:rPr>
+                <w:rFonts w:ascii="Calibri" w:hAnsi="Calibri" w:eastAsia="SimSun"/>
+                <w:sz w:val="21"/>
+              </w:rPr>
+              <w:t>本包90分钟合成招聘分类课由影片原12分钟片段扩展，补训练集拟合预处理、固定划分、指标分母和同伴复现。</w:t>
+            </w:r>
+          </w:p>
+        </w:tc>
+        <w:tc>
+          <w:tcPr>
+            <w:tcW w:type="dxa" w:w="3009"/>
+          </w:tcPr>
+          <w:p>
+            <w:pPr>
+              <w:spacing w:after="60"/>
+              <w:ind w:firstLine="0"/>
+            </w:pPr>
+            <w:r>
+              <w:rPr>
+                <w:rFonts w:ascii="Calibri" w:hAnsi="Calibri" w:eastAsia="SimSun"/>
+                <w:sz w:val="21"/>
+              </w:rPr>
+              <w:t>可直接作为课程说课，任务与本包案例三高度对应；100分量规是本包新增送审设计，影片未声称已执行权重。</w:t>
+            </w:r>
+          </w:p>
+        </w:tc>
+      </w:tr>
+      <w:tr>
+        <w:tc>
+          <w:tcPr>
+            <w:tcW w:type="dxa" w:w="3009"/>
+          </w:tcPr>
+          <w:p>
+            <w:pPr>
+              <w:spacing w:after="60"/>
+              <w:ind w:firstLine="0"/>
+            </w:pPr>
+            <w:r>
+              <w:rPr>
+                <w:rFonts w:ascii="Calibri" w:hAnsi="Calibri" w:eastAsia="SimSun"/>
+                <w:sz w:val="21"/>
+              </w:rPr>
+              <w:t>AI工程概览</w:t>
+            </w:r>
+          </w:p>
+        </w:tc>
+        <w:tc>
+          <w:tcPr>
+            <w:tcW w:type="dxa" w:w="3009"/>
+          </w:tcPr>
+          <w:p>
+            <w:pPr>
+              <w:spacing w:after="60"/>
+              <w:ind w:firstLine="0"/>
+            </w:pPr>
+            <w:r>
+              <w:rPr>
+                <w:rFonts w:ascii="Calibri" w:hAnsi="Calibri" w:eastAsia="SimSun"/>
+                <w:sz w:val="21"/>
+              </w:rPr>
+              <w:t>本包90分钟离线文档助手课扩展核验、拒答、干扰输入、许可和评估；正式专业归属尚待确认。</w:t>
+            </w:r>
+          </w:p>
+        </w:tc>
+        <w:tc>
+          <w:tcPr>
+            <w:tcW w:type="dxa" w:w="3009"/>
+          </w:tcPr>
+          <w:p>
+            <w:pPr>
+              <w:spacing w:after="60"/>
+              <w:ind w:firstLine="0"/>
+            </w:pPr>
+            <w:r>
+              <w:rPr>
+                <w:rFonts w:ascii="Calibri" w:hAnsi="Calibri" w:eastAsia="SimSun"/>
+                <w:sz w:val="21"/>
+              </w:rPr>
+              <w:t>18—40秒专业定位已用Spark本人克隆声音重录，字幕及画面同步修订为专业关联待确认；其余技术目标和案例可复用。此修订不作为区块链专业正式覆盖或课程认定证据。</w:t>
+            </w:r>
+          </w:p>
+        </w:tc>
+      </w:tr>
+    </w:tbl>
+    <w:p>
+      <w:pPr>
+        <w:jc w:val="both"/>
+      </w:pPr>
+      <w:r>
+        <w:t>影片中的12或15分钟典型课堂段是原稿的说课示例，新资源包中的90分钟活动是本次补充的完整课堂方案。两者分别列示，不能把影片片段说成已执行的90分钟课，也不能把原案例总数算成本包新提供的24例。</w:t>
+      </w:r>
+    </w:p>
+    <w:p>
+      <w:pPr>
+        <w:pStyle w:val="Heading1"/>
+      </w:pPr>
+      <w:r>
+        <w:t>二、AI定位修订结果</w:t>
       </w:r>
     </w:p>
     <w:p>
@@ -24,7 +476,7 @@
         <w:jc w:val="both"/>
       </w:pPr>
       <w:r>
-        <w:t>关联项目目录：C:\Users\谢鑫\Documents\Codex\2026-10-10\files-pasted-by-the-user-3\outputs\course_series_10</w:t>
+        <w:t>原AI影片18—40秒将专业归属表述得过于确定。最终交付版已替换这22秒旁白、字幕和画面，表述为“AI工程概览围绕基础模型应用展开，区块链专业关联尚待确认”，使用同一Spark本人克隆声音。修订句的声纹相似度最低0.737077，字符错误率0；影片仍为600秒。正式专业归属和培养目标匹配由专业负责人核对，不以改文案代替正式专业依据。</w:t>
       </w:r>
     </w:p>
     <w:p>
@@ -32,31 +484,7 @@
         <w:pStyle w:val="Heading1"/>
       </w:pPr>
       <w:r>
-        <w:t>核对方法与复用原则</w:t>
-      </w:r>
-    </w:p>
-    <w:p>
-      <w:pPr>
-        <w:jc w:val="both"/>
-      </w:pPr>
-      <w:r>
-        <w:t>核对project/course-film/src/courses.json及各assets/&lt;code&gt;/plan600.json中的目标、案例、时序、评价和边界。读取已有声音质量/视频质量报告；已完成成片仅用ffprobe核对基本封装。本报告引用的是原项目质量记录，不把它写成本轮重做的全片试听或全解码。</w:t>
-      </w:r>
-    </w:p>
-    <w:p>
-      <w:pPr>
-        <w:jc w:val="both"/>
-      </w:pPr>
-      <w:r>
-        <w:t>既有影片为600秒说课汇报，实际分为27场景；本包新增脚本为12×50秒备选稿。两者不能称为同一时间线。原稿课堂片段12或15分钟、本包典型一课90分钟、影片总长10分钟分别表示不同对象。</w:t>
-      </w:r>
-    </w:p>
-    <w:p>
-      <w:pPr>
-        <w:pStyle w:val="Heading1"/>
-      </w:pPr>
-      <w:r>
-        <w:t>逐课程对应</w:t>
+        <w:t>三、最终成片与交付证据</w:t>
       </w:r>
     </w:p>
     <w:tbl>
@@ -122,7 +550,7 @@
                   <w14:round/>
                 </w14:textOutline>
               </w:rPr>
-              <w:t>既有影片示例</w:t>
+              <w:t>时长</w:t>
             </w:r>
           </w:p>
         </w:tc>
@@ -147,7 +575,7 @@
                   <w14:round/>
                 </w14:textOutline>
               </w:rPr>
-              <w:t>原课堂片段</w:t>
+              <w:t>教学设计汉字数</w:t>
             </w:r>
           </w:p>
         </w:tc>
@@ -172,7 +600,7 @@
                   <w14:round/>
                 </w14:textOutline>
               </w:rPr>
-              <w:t>本包典型课与差异</w:t>
+              <w:t>本包案例</w:t>
             </w:r>
           </w:p>
         </w:tc>
@@ -197,29 +625,12 @@
                   <w14:round/>
                 </w14:textOutline>
               </w:rPr>
-              <w:t>当前采用结论</w:t>
+              <w:t>最终完整质量MP4的SHA256</w:t>
             </w:r>
           </w:p>
         </w:tc>
       </w:tr>
-    </w:tbl>
-    <w:tbl>
-      <w:tblPr>
-        <w:tblStyle w:val="LightShading-Accent1"/>
-        <w:tblW w:type="auto" w:w="0"/>
-        <w:tblLook w:firstColumn="1" w:firstRow="1" w:lastColumn="0" w:lastRow="0" w:noHBand="0" w:noVBand="1" w:val="04A0"/>
-      </w:tblPr>
-      <w:tblGrid>
-        <w:gridCol w:w="1805"/>
-        <w:gridCol w:w="1805"/>
-        <w:gridCol w:w="1805"/>
-        <w:gridCol w:w="1805"/>
-        <w:gridCol w:w="1805"/>
-      </w:tblGrid>
       <w:tr>
-        <w:trPr>
-          <w:tblHeader/>
-        </w:trPr>
         <w:tc>
           <w:tcPr>
             <w:tcW w:type="dxa" w:w="1805"/>
@@ -233,13 +644,6 @@
               <w:rPr>
                 <w:rFonts w:ascii="Calibri" w:hAnsi="Calibri" w:eastAsia="SimSun"/>
                 <w:sz w:val="21"/>
-                <w14:textOutline w14:w="1905" w14:cap="flat" w14:cmpd="sng" w14:algn="ctr">
-                  <w14:solidFill>
-                    <w14:srgbClr w14:val="202B3A"/>
-                  </w14:solidFill>
-                  <w14:prstDash w14:val="solid"/>
-                  <w14:round/>
-                </w14:textOutline>
               </w:rPr>
               <w:t>离散数学</w:t>
             </w:r>
@@ -258,15 +662,8 @@
               <w:rPr>
                 <w:rFonts w:ascii="Calibri" w:hAnsi="Calibri" w:eastAsia="SimSun"/>
                 <w:sz w:val="21"/>
-                <w14:textOutline w14:w="1905" w14:cap="flat" w14:cmpd="sng" w14:algn="ctr">
-                  <w14:solidFill>
-                    <w14:srgbClr w14:val="202B3A"/>
-                  </w14:solidFill>
-                  <w14:prstDash w14:val="solid"/>
-                  <w14:round/>
-                </w14:textOutline>
               </w:rPr>
-              <w:t>图的遍历与文化遗产数字化保护；欧拉路径</w:t>
+              <w:t>600秒</w:t>
             </w:r>
           </w:p>
         </w:tc>
@@ -283,15 +680,8 @@
               <w:rPr>
                 <w:rFonts w:ascii="Calibri" w:hAnsi="Calibri" w:eastAsia="SimSun"/>
                 <w:sz w:val="21"/>
-                <w14:textOutline w14:w="1905" w14:cap="flat" w14:cmpd="sng" w14:algn="ctr">
-                  <w14:solidFill>
-                    <w14:srgbClr w14:val="202B3A"/>
-                  </w14:solidFill>
-                  <w14:prstDash w14:val="solid"/>
-                  <w14:round/>
-                </w14:textOutline>
               </w:rPr>
-              <w:t>15分钟，3/7/4/1</w:t>
+              <w:t>2455</w:t>
             </w:r>
           </w:p>
         </w:tc>
@@ -308,15 +698,8 @@
               <w:rPr>
                 <w:rFonts w:ascii="Calibri" w:hAnsi="Calibri" w:eastAsia="SimSun"/>
                 <w:sz w:val="21"/>
-                <w14:textOutline w14:w="1905" w14:cap="flat" w14:cmpd="sng" w14:algn="ctr">
-                  <w14:solidFill>
-                    <w14:srgbClr w14:val="202B3A"/>
-                  </w14:solidFill>
-                  <w14:prstDash w14:val="solid"/>
-                  <w14:round/>
-                </w14:textOutline>
               </w:rPr>
-              <w:t>本包典型课为90分钟的合成联系图与广度优先搜索，不与欧拉逐边遍历混写；影片文化遗产案例是原稿补充案例，不计入本包四例。</w:t>
+              <w:t>4例</w:t>
             </w:r>
           </w:p>
         </w:tc>
@@ -333,37 +716,13 @@
               <w:rPr>
                 <w:rFonts w:ascii="Calibri" w:hAnsi="Calibri" w:eastAsia="SimSun"/>
                 <w:sz w:val="21"/>
-                <w14:textOutline w14:w="1905" w14:cap="flat" w14:cmpd="sng" w14:algn="ctr">
-                  <w14:solidFill>
-                    <w14:srgbClr w14:val="202B3A"/>
-                  </w14:solidFill>
-                  <w14:prstDash w14:val="solid"/>
-                  <w14:round/>
-                </w14:textOutline>
               </w:rPr>
-              <w:t>知识、能力和价值目标与本包一致，可作课程说课与原稿补充示例；须随片附本说明和新增量规。</w:t>
+              <w:t>4f60274cdaf7b1c14bf8b91d4a5a8538db4f85180514e53bac8fee77904fdb07</w:t>
             </w:r>
           </w:p>
         </w:tc>
       </w:tr>
-    </w:tbl>
-    <w:tbl>
-      <w:tblPr>
-        <w:tblStyle w:val="LightShading-Accent1"/>
-        <w:tblW w:type="auto" w:w="0"/>
-        <w:tblLook w:firstColumn="1" w:firstRow="1" w:lastColumn="0" w:lastRow="0" w:noHBand="0" w:noVBand="1" w:val="04A0"/>
-      </w:tblPr>
-      <w:tblGrid>
-        <w:gridCol w:w="1805"/>
-        <w:gridCol w:w="1805"/>
-        <w:gridCol w:w="1805"/>
-        <w:gridCol w:w="1805"/>
-        <w:gridCol w:w="1805"/>
-      </w:tblGrid>
       <w:tr>
-        <w:trPr>
-          <w:tblHeader/>
-        </w:trPr>
         <w:tc>
           <w:tcPr>
             <w:tcW w:type="dxa" w:w="1805"/>
@@ -377,13 +736,6 @@
               <w:rPr>
                 <w:rFonts w:ascii="Calibri" w:hAnsi="Calibri" w:eastAsia="SimSun"/>
                 <w:sz w:val="21"/>
-                <w14:textOutline w14:w="1905" w14:cap="flat" w14:cmpd="sng" w14:algn="ctr">
-                  <w14:solidFill>
-                    <w14:srgbClr w14:val="202B3A"/>
-                  </w14:solidFill>
-                  <w14:prstDash w14:val="solid"/>
-                  <w14:round/>
-                </w14:textOutline>
               </w:rPr>
               <w:t>C语言程序设计</w:t>
             </w:r>
@@ -402,15 +754,8 @@
               <w:rPr>
                 <w:rFonts w:ascii="Calibri" w:hAnsi="Calibri" w:eastAsia="SimSun"/>
                 <w:sz w:val="21"/>
-                <w14:textOutline w14:w="1905" w14:cap="flat" w14:cmpd="sng" w14:algn="ctr">
-                  <w14:solidFill>
-                    <w14:srgbClr w14:val="202B3A"/>
-                  </w14:solidFill>
-                  <w14:prstDash w14:val="solid"/>
-                  <w14:round/>
-                </w14:textOutline>
               </w:rPr>
-              <w:t>指针与内存管理的工匠精神；动态内存闭环</w:t>
+              <w:t>600秒</w:t>
             </w:r>
           </w:p>
         </w:tc>
@@ -427,15 +772,8 @@
               <w:rPr>
                 <w:rFonts w:ascii="Calibri" w:hAnsi="Calibri" w:eastAsia="SimSun"/>
                 <w:sz w:val="21"/>
-                <w14:textOutline w14:w="1905" w14:cap="flat" w14:cmpd="sng" w14:algn="ctr">
-                  <w14:solidFill>
-                    <w14:srgbClr w14:val="202B3A"/>
-                  </w14:solidFill>
-                  <w14:prstDash w14:val="solid"/>
-                  <w14:round/>
-                </w14:textOutline>
               </w:rPr>
-              <w:t>15分钟，3/7/4/1</w:t>
+              <w:t>2422</w:t>
             </w:r>
           </w:p>
         </w:tc>
@@ -452,15 +790,8 @@
               <w:rPr>
                 <w:rFonts w:ascii="Calibri" w:hAnsi="Calibri" w:eastAsia="SimSun"/>
                 <w:sz w:val="21"/>
-                <w14:textOutline w14:w="1905" w14:cap="flat" w14:cmpd="sng" w14:algn="ctr">
-                  <w14:solidFill>
-                    <w14:srgbClr w14:val="202B3A"/>
-                  </w14:solidFill>
-                  <w14:prstDash w14:val="solid"/>
-                  <w14:round/>
-                </w14:textOutline>
               </w:rPr>
-              <w:t>本包典型课为90分钟字符串边界与输入检查；影片动态内存示例对应本包案例二，二者分别覆盖数组边界与生命周期。</w:t>
+              <w:t>4例</w:t>
             </w:r>
           </w:p>
         </w:tc>
@@ -477,37 +808,13 @@
               <w:rPr>
                 <w:rFonts w:ascii="Calibri" w:hAnsi="Calibri" w:eastAsia="SimSun"/>
                 <w:sz w:val="21"/>
-                <w14:textOutline w14:w="1905" w14:cap="flat" w14:cmpd="sng" w14:algn="ctr">
-                  <w14:solidFill>
-                    <w14:srgbClr w14:val="202B3A"/>
-                  </w14:solidFill>
-                  <w14:prstDash w14:val="solid"/>
-                  <w14:round/>
-                </w14:textOutline>
               </w:rPr>
-              <w:t>可作为本包课程说课，动态内存案例直接关联；须附本包100分量规和90分钟示例课说明。</w:t>
+              <w:t>ac75fed77972a1c3a762ed7a775321fc6e75f4718c8b6739562220de92a5bbb3</w:t>
             </w:r>
           </w:p>
         </w:tc>
       </w:tr>
-    </w:tbl>
-    <w:tbl>
-      <w:tblPr>
-        <w:tblStyle w:val="LightShading-Accent1"/>
-        <w:tblW w:type="auto" w:w="0"/>
-        <w:tblLook w:firstColumn="1" w:firstRow="1" w:lastColumn="0" w:lastRow="0" w:noHBand="0" w:noVBand="1" w:val="04A0"/>
-      </w:tblPr>
-      <w:tblGrid>
-        <w:gridCol w:w="1805"/>
-        <w:gridCol w:w="1805"/>
-        <w:gridCol w:w="1805"/>
-        <w:gridCol w:w="1805"/>
-        <w:gridCol w:w="1805"/>
-      </w:tblGrid>
       <w:tr>
-        <w:trPr>
-          <w:tblHeader/>
-        </w:trPr>
         <w:tc>
           <w:tcPr>
             <w:tcW w:type="dxa" w:w="1805"/>
@@ -521,13 +828,6 @@
               <w:rPr>
                 <w:rFonts w:ascii="Calibri" w:hAnsi="Calibri" w:eastAsia="SimSun"/>
                 <w:sz w:val="21"/>
-                <w14:textOutline w14:w="1905" w14:cap="flat" w14:cmpd="sng" w14:algn="ctr">
-                  <w14:solidFill>
-                    <w14:srgbClr w14:val="202B3A"/>
-                  </w14:solidFill>
-                  <w14:prstDash w14:val="solid"/>
-                  <w14:round/>
-                </w14:textOutline>
               </w:rPr>
               <w:t>网络安全技术</w:t>
             </w:r>
@@ -546,15 +846,8 @@
               <w:rPr>
                 <w:rFonts w:ascii="Calibri" w:hAnsi="Calibri" w:eastAsia="SimSun"/>
                 <w:sz w:val="21"/>
-                <w14:textOutline w14:w="1905" w14:cap="flat" w14:cmpd="sng" w14:algn="ctr">
-                  <w14:solidFill>
-                    <w14:srgbClr w14:val="202B3A"/>
-                  </w14:solidFill>
-                  <w14:prstDash w14:val="solid"/>
-                  <w14:round/>
-                </w14:textOutline>
               </w:rPr>
-              <w:t>纵深防御体系与安全责任落实</w:t>
+              <w:t>600秒</w:t>
             </w:r>
           </w:p>
         </w:tc>
@@ -571,15 +864,8 @@
               <w:rPr>
                 <w:rFonts w:ascii="Calibri" w:hAnsi="Calibri" w:eastAsia="SimSun"/>
                 <w:sz w:val="21"/>
-                <w14:textOutline w14:w="1905" w14:cap="flat" w14:cmpd="sng" w14:algn="ctr">
-                  <w14:solidFill>
-                    <w14:srgbClr w14:val="202B3A"/>
-                  </w14:solidFill>
-                  <w14:prstDash w14:val="solid"/>
-                  <w14:round/>
-                </w14:textOutline>
               </w:rPr>
-              <w:t>12分钟，2/5/4/1</w:t>
+              <w:t>2391</w:t>
             </w:r>
           </w:p>
         </w:tc>
@@ -596,15 +882,8 @@
               <w:rPr>
                 <w:rFonts w:ascii="Calibri" w:hAnsi="Calibri" w:eastAsia="SimSun"/>
                 <w:sz w:val="21"/>
-                <w14:textOutline w14:w="1905" w14:cap="flat" w14:cmpd="sng" w14:algn="ctr">
-                  <w14:solidFill>
-                    <w14:srgbClr w14:val="202B3A"/>
-                  </w14:solidFill>
-                  <w14:prstDash w14:val="solid"/>
-                  <w14:round/>
-                </w14:textOutline>
               </w:rPr>
-              <w:t>本包典型课为90分钟虚构预约服务的纵深防御评审，细化权限矩阵、允许/拒绝验证、恢复和残余风险。</w:t>
+              <w:t>4例</w:t>
             </w:r>
           </w:p>
         </w:tc>
@@ -621,37 +900,13 @@
               <w:rPr>
                 <w:rFonts w:ascii="Calibri" w:hAnsi="Calibri" w:eastAsia="SimSun"/>
                 <w:sz w:val="21"/>
-                <w14:textOutline w14:w="1905" w14:cap="flat" w14:cmpd="sng" w14:algn="ctr">
-                  <w14:solidFill>
-                    <w14:srgbClr w14:val="202B3A"/>
-                  </w14:solidFill>
-                  <w14:prstDash w14:val="solid"/>
-                  <w14:round/>
-                </w14:textOutline>
               </w:rPr>
-              <w:t>可作为本包课程说课，影片案例直接对应案例四；新增量规和授权范围另附，不将影片片段写成完整90分钟课。</w:t>
+              <w:t>afe3d710857d663da56da936897a49fa9cb9de056f30704a52093cca147cc67e</w:t>
             </w:r>
           </w:p>
         </w:tc>
       </w:tr>
-    </w:tbl>
-    <w:tbl>
-      <w:tblPr>
-        <w:tblStyle w:val="LightShading-Accent1"/>
-        <w:tblW w:type="auto" w:w="0"/>
-        <w:tblLook w:firstColumn="1" w:firstRow="1" w:lastColumn="0" w:lastRow="0" w:noHBand="0" w:noVBand="1" w:val="04A0"/>
-      </w:tblPr>
-      <w:tblGrid>
-        <w:gridCol w:w="1805"/>
-        <w:gridCol w:w="1805"/>
-        <w:gridCol w:w="1805"/>
-        <w:gridCol w:w="1805"/>
-        <w:gridCol w:w="1805"/>
-      </w:tblGrid>
       <w:tr>
-        <w:trPr>
-          <w:tblHeader/>
-        </w:trPr>
         <w:tc>
           <w:tcPr>
             <w:tcW w:type="dxa" w:w="1805"/>
@@ -665,13 +920,6 @@
               <w:rPr>
                 <w:rFonts w:ascii="Calibri" w:hAnsi="Calibri" w:eastAsia="SimSun"/>
                 <w:sz w:val="21"/>
-                <w14:textOutline w14:w="1905" w14:cap="flat" w14:cmpd="sng" w14:algn="ctr">
-                  <w14:solidFill>
-                    <w14:srgbClr w14:val="202B3A"/>
-                  </w14:solidFill>
-                  <w14:prstDash w14:val="solid"/>
-                  <w14:round/>
-                </w14:textOutline>
               </w:rPr>
               <w:t>嵌入式系统</w:t>
             </w:r>
@@ -690,15 +938,8 @@
               <w:rPr>
                 <w:rFonts w:ascii="Calibri" w:hAnsi="Calibri" w:eastAsia="SimSun"/>
                 <w:sz w:val="21"/>
-                <w14:textOutline w14:w="1905" w14:cap="flat" w14:cmpd="sng" w14:algn="ctr">
-                  <w14:solidFill>
-                    <w14:srgbClr w14:val="202B3A"/>
-                  </w14:solidFill>
-                  <w14:prstDash w14:val="solid"/>
-                  <w14:round/>
-                </w14:textOutline>
               </w:rPr>
-              <w:t>工业物联网与智能制造中的嵌入式安全；Linux设备驱动</w:t>
+              <w:t>600秒</w:t>
             </w:r>
           </w:p>
         </w:tc>
@@ -715,15 +956,8 @@
               <w:rPr>
                 <w:rFonts w:ascii="Calibri" w:hAnsi="Calibri" w:eastAsia="SimSun"/>
                 <w:sz w:val="21"/>
-                <w14:textOutline w14:w="1905" w14:cap="flat" w14:cmpd="sng" w14:algn="ctr">
-                  <w14:solidFill>
-                    <w14:srgbClr w14:val="202B3A"/>
-                  </w14:solidFill>
-                  <w14:prstDash w14:val="solid"/>
-                  <w14:round/>
-                </w14:textOutline>
               </w:rPr>
-              <w:t>15分钟，3/7/4/1</w:t>
+              <w:t>2386</w:t>
             </w:r>
           </w:p>
         </w:tc>
@@ -740,15 +974,8 @@
               <w:rPr>
                 <w:rFonts w:ascii="Calibri" w:hAnsi="Calibri" w:eastAsia="SimSun"/>
                 <w:sz w:val="21"/>
-                <w14:textOutline w14:w="1905" w14:cap="flat" w14:cmpd="sng" w14:algn="ctr">
-                  <w14:solidFill>
-                    <w14:srgbClr w14:val="202B3A"/>
-                  </w14:solidFill>
-                  <w14:prstDash w14:val="solid"/>
-                  <w14:round/>
-                </w14:textOutline>
               </w:rPr>
-              <w:t>本包典型课为90分钟虚拟灌溉状态机和故障安全；影片强调驱动输入、权限与中断处理，对应案例一及接口安全学习，不代替本包控制状态机测试。</w:t>
+              <w:t>4例</w:t>
             </w:r>
           </w:p>
         </w:tc>
@@ -765,37 +992,13 @@
               <w:rPr>
                 <w:rFonts w:ascii="Calibri" w:hAnsi="Calibri" w:eastAsia="SimSun"/>
                 <w:sz w:val="21"/>
-                <w14:textOutline w14:w="1905" w14:cap="flat" w14:cmpd="sng" w14:algn="ctr">
-                  <w14:solidFill>
-                    <w14:srgbClr w14:val="202B3A"/>
-                  </w14:solidFill>
-                  <w14:prstDash w14:val="solid"/>
-                  <w14:round/>
-                </w14:textOutline>
               </w:rPr>
-              <w:t>可作为课程说课和驱动安全补充示例；须保留本包实时、状态机及故障证据要求，正式大纲确认时与原Linux/ARM章节核对。</w:t>
+              <w:t>d54eabb649fdf6bfd1f64a0dc1682b64ebc1f7d38fdf4716d3898d22d942beac</w:t>
             </w:r>
           </w:p>
         </w:tc>
       </w:tr>
-    </w:tbl>
-    <w:tbl>
-      <w:tblPr>
-        <w:tblStyle w:val="LightShading-Accent1"/>
-        <w:tblW w:type="auto" w:w="0"/>
-        <w:tblLook w:firstColumn="1" w:firstRow="1" w:lastColumn="0" w:lastRow="0" w:noHBand="0" w:noVBand="1" w:val="04A0"/>
-      </w:tblPr>
-      <w:tblGrid>
-        <w:gridCol w:w="1805"/>
-        <w:gridCol w:w="1805"/>
-        <w:gridCol w:w="1805"/>
-        <w:gridCol w:w="1805"/>
-        <w:gridCol w:w="1805"/>
-      </w:tblGrid>
       <w:tr>
-        <w:trPr>
-          <w:tblHeader/>
-        </w:trPr>
         <w:tc>
           <w:tcPr>
             <w:tcW w:type="dxa" w:w="1805"/>
@@ -809,13 +1012,6 @@
               <w:rPr>
                 <w:rFonts w:ascii="Calibri" w:hAnsi="Calibri" w:eastAsia="SimSun"/>
                 <w:sz w:val="21"/>
-                <w14:textOutline w14:w="1905" w14:cap="flat" w14:cmpd="sng" w14:algn="ctr">
-                  <w14:solidFill>
-                    <w14:srgbClr w14:val="202B3A"/>
-                  </w14:solidFill>
-                  <w14:prstDash w14:val="solid"/>
-                  <w14:round/>
-                </w14:textOutline>
               </w:rPr>
               <w:t>数据挖掘</w:t>
             </w:r>
@@ -834,15 +1030,8 @@
               <w:rPr>
                 <w:rFonts w:ascii="Calibri" w:hAnsi="Calibri" w:eastAsia="SimSun"/>
                 <w:sz w:val="21"/>
-                <w14:textOutline w14:w="1905" w14:cap="flat" w14:cmpd="sng" w14:algn="ctr">
-                  <w14:solidFill>
-                    <w14:srgbClr w14:val="202B3A"/>
-                  </w14:solidFill>
-                  <w14:prstDash w14:val="solid"/>
-                  <w14:round/>
-                </w14:textOutline>
               </w:rPr>
-              <w:t>AI招聘算法中的公平性问题；近邻与分组审计</w:t>
+              <w:t>600秒</w:t>
             </w:r>
           </w:p>
         </w:tc>
@@ -859,15 +1048,8 @@
               <w:rPr>
                 <w:rFonts w:ascii="Calibri" w:hAnsi="Calibri" w:eastAsia="SimSun"/>
                 <w:sz w:val="21"/>
-                <w14:textOutline w14:w="1905" w14:cap="flat" w14:cmpd="sng" w14:algn="ctr">
-                  <w14:solidFill>
-                    <w14:srgbClr w14:val="202B3A"/>
-                  </w14:solidFill>
-                  <w14:prstDash w14:val="solid"/>
-                  <w14:round/>
-                </w14:textOutline>
               </w:rPr>
-              <w:t>12分钟，2/5/4/1</w:t>
+              <w:t>2410</w:t>
             </w:r>
           </w:p>
         </w:tc>
@@ -884,15 +1066,8 @@
               <w:rPr>
                 <w:rFonts w:ascii="Calibri" w:hAnsi="Calibri" w:eastAsia="SimSun"/>
                 <w:sz w:val="21"/>
-                <w14:textOutline w14:w="1905" w14:cap="flat" w14:cmpd="sng" w14:algn="ctr">
-                  <w14:solidFill>
-                    <w14:srgbClr w14:val="202B3A"/>
-                  </w14:solidFill>
-                  <w14:prstDash w14:val="solid"/>
-                  <w14:round/>
-                </w14:textOutline>
               </w:rPr>
-              <w:t>本包90分钟合成招聘分类课由影片原12分钟片段扩展，补训练集拟合预处理、固定划分、指标分母和同伴复现。</w:t>
+              <w:t>4例</w:t>
             </w:r>
           </w:p>
         </w:tc>
@@ -909,37 +1084,13 @@
               <w:rPr>
                 <w:rFonts w:ascii="Calibri" w:hAnsi="Calibri" w:eastAsia="SimSun"/>
                 <w:sz w:val="21"/>
-                <w14:textOutline w14:w="1905" w14:cap="flat" w14:cmpd="sng" w14:algn="ctr">
-                  <w14:solidFill>
-                    <w14:srgbClr w14:val="202B3A"/>
-                  </w14:solidFill>
-                  <w14:prstDash w14:val="solid"/>
-                  <w14:round/>
-                </w14:textOutline>
               </w:rPr>
-              <w:t>可直接作为课程说课，任务与本包案例三高度对应；100分量规是本包新增送审设计，影片未声称已执行权重。</w:t>
+              <w:t>cbb28e06f905cdc3b1c670024ce0d43e3a1faf85c016a3fd7f9eab04f84974ff</w:t>
             </w:r>
           </w:p>
         </w:tc>
       </w:tr>
-    </w:tbl>
-    <w:tbl>
-      <w:tblPr>
-        <w:tblStyle w:val="LightShading-Accent1"/>
-        <w:tblW w:type="auto" w:w="0"/>
-        <w:tblLook w:firstColumn="1" w:firstRow="1" w:lastColumn="0" w:lastRow="0" w:noHBand="0" w:noVBand="1" w:val="04A0"/>
-      </w:tblPr>
-      <w:tblGrid>
-        <w:gridCol w:w="1805"/>
-        <w:gridCol w:w="1805"/>
-        <w:gridCol w:w="1805"/>
-        <w:gridCol w:w="1805"/>
-        <w:gridCol w:w="1805"/>
-      </w:tblGrid>
       <w:tr>
-        <w:trPr>
-          <w:tblHeader/>
-        </w:trPr>
         <w:tc>
           <w:tcPr>
             <w:tcW w:type="dxa" w:w="1805"/>
@@ -953,13 +1104,6 @@
               <w:rPr>
                 <w:rFonts w:ascii="Calibri" w:hAnsi="Calibri" w:eastAsia="SimSun"/>
                 <w:sz w:val="21"/>
-                <w14:textOutline w14:w="1905" w14:cap="flat" w14:cmpd="sng" w14:algn="ctr">
-                  <w14:solidFill>
-                    <w14:srgbClr w14:val="202B3A"/>
-                  </w14:solidFill>
-                  <w14:prstDash w14:val="solid"/>
-                  <w14:round/>
-                </w14:textOutline>
               </w:rPr>
               <w:t>AI工程概览</w:t>
             </w:r>
@@ -978,15 +1122,8 @@
               <w:rPr>
                 <w:rFonts w:ascii="Calibri" w:hAnsi="Calibri" w:eastAsia="SimSun"/>
                 <w:sz w:val="21"/>
-                <w14:textOutline w14:w="1905" w14:cap="flat" w14:cmpd="sng" w14:algn="ctr">
-                  <w14:solidFill>
-                    <w14:srgbClr w14:val="202B3A"/>
-                  </w14:solidFill>
-                  <w14:prstDash w14:val="solid"/>
-                  <w14:round/>
-                </w14:textOutline>
               </w:rPr>
-              <w:t>AI幻觉与责任边界；检索与人工核查</w:t>
+              <w:t>600秒</w:t>
             </w:r>
           </w:p>
         </w:tc>
@@ -1003,15 +1140,8 @@
               <w:rPr>
                 <w:rFonts w:ascii="Calibri" w:hAnsi="Calibri" w:eastAsia="SimSun"/>
                 <w:sz w:val="21"/>
-                <w14:textOutline w14:w="1905" w14:cap="flat" w14:cmpd="sng" w14:algn="ctr">
-                  <w14:solidFill>
-                    <w14:srgbClr w14:val="202B3A"/>
-                  </w14:solidFill>
-                  <w14:prstDash w14:val="solid"/>
-                  <w14:round/>
-                </w14:textOutline>
               </w:rPr>
-              <w:t>15分钟，3/7/4/1</w:t>
+              <w:t>2436</w:t>
             </w:r>
           </w:p>
         </w:tc>
@@ -1028,15 +1158,8 @@
               <w:rPr>
                 <w:rFonts w:ascii="Calibri" w:hAnsi="Calibri" w:eastAsia="SimSun"/>
                 <w:sz w:val="21"/>
-                <w14:textOutline w14:w="1905" w14:cap="flat" w14:cmpd="sng" w14:algn="ctr">
-                  <w14:solidFill>
-                    <w14:srgbClr w14:val="202B3A"/>
-                  </w14:solidFill>
-                  <w14:prstDash w14:val="solid"/>
-                  <w14:round/>
-                </w14:textOutline>
               </w:rPr>
-              <w:t>本包90分钟离线文档助手课扩展核验、拒答、干扰输入、许可和评估；正式专业归属尚待确认。</w:t>
+              <w:t>4例</w:t>
             </w:r>
           </w:p>
         </w:tc>
@@ -1053,15 +1176,8 @@
               <w:rPr>
                 <w:rFonts w:ascii="Calibri" w:hAnsi="Calibri" w:eastAsia="SimSun"/>
                 <w:sz w:val="21"/>
-                <w14:textOutline w14:w="1905" w14:cap="flat" w14:cmpd="sng" w14:algn="ctr">
-                  <w14:solidFill>
-                    <w14:srgbClr w14:val="202B3A"/>
-                  </w14:solidFill>
-                  <w14:prstDash w14:val="solid"/>
-                  <w14:round/>
-                </w14:textOutline>
               </w:rPr>
-              <w:t>技术目标和幻觉案例可复用；18—40秒identity音频明确称“面向区块链工程专业”，与本包候选映射冲突，不能直接作为专业覆盖或正式认定证据。需改该段本人配音并同步字幕/画面，或经正式专业确认后决定。</w:t>
+              <w:t>c4641c180b6559b6cbd73ee69220c6572dfa0eae61f67a488ca62c44118c5d66</w:t>
             </w:r>
           </w:p>
         </w:tc>
@@ -1069,18 +1185,10 @@
     </w:tbl>
     <w:p>
       <w:pPr>
-        <w:pStyle w:val="Heading1"/>
+        <w:jc w:val="both"/>
       </w:pPr>
       <w:r>
-        <w:t>实际文件与质量快照</w:t>
-      </w:r>
-    </w:p>
-    <w:p>
-      <w:pPr>
-        <w:pStyle w:val="Heading2"/>
-      </w:pPr>
-      <w:r>
-        <w:t>离散数学</w:t>
+        <w:t>完整质量影片位于本目录“成片”，公开网页提供对应压缩副本和相同字幕。离散数学当前采用含e5位置修正的完整质量版，SHA256以表中值为准。六个网页副本均已完整解码核验，最终画面、字幕和声音来源记录已核对；没有声明已完成人工全片听审。</w:t>
       </w:r>
     </w:p>
     <w:p>
@@ -1088,7 +1196,15 @@
         <w:jc w:val="both"/>
       </w:pPr>
       <w:r>
-        <w:t>计划：C:\Users\谢鑫\Documents\Codex\2026-10-10\files-pasted-by-the-user-3\outputs\course_series_10\assets\discrete\plan600.json</w:t>
+        <w:t>技术依据为本目录video-validation.json及第5项媒体验收报告、course-media-audit.json；来源原件留存，修改仅作用于本项目新生成的副本。所有新旁白沿用用户指定的Spark本人克隆声音。私有参考录音保留在Spark，不进入公开资源或本次文档。</w:t>
+      </w:r>
+    </w:p>
+    <w:p>
+      <w:pPr>
+        <w:pStyle w:val="Heading1"/>
+      </w:pPr>
+      <w:r>
+        <w:t>四、新设计与实际使用要求</w:t>
       </w:r>
     </w:p>
     <w:p>
@@ -1096,7 +1212,7 @@
         <w:jc w:val="both"/>
       </w:pPr>
       <w:r>
-        <w:t>场景数：27；0—600秒连续性：True。</w:t>
+        <w:t>影片定性评价与本包新增100分量规遵循相同原则，具体权重以随片完整教学设计为新送审设计；影片没有宣称这些权重已实施。建议学时、课堂安排和专业目标须与正式大纲核对。四例中技术任务、价值问题、学生产出及量规均为设计，育人成效由真实课堂、作品和评价证据核验。</w:t>
       </w:r>
     </w:p>
     <w:p>
@@ -1104,7 +1220,7 @@
         <w:jc w:val="both"/>
       </w:pPr>
       <w:r>
-        <w:t>成片：C:\Users\谢鑫\Documents\Codex\2026-10-10\files-pasted-by-the-user-3\outputs\course_series_10\final\离散数学_10分钟说课_本人配音.mp4；核对时存在：False。</w:t>
+        <w:t>本包保留十二场景备选旁白分镜，用于未来将影片进一步改编为本包新设计；它不是当前成片的逐字字幕。当前字幕应使用“成片”目录的SRT或网页VTT。若启用备选稿，继续调用Spark的lecture声音，并重新检查旁白、字幕、画面及时长。</w:t>
       </w:r>
     </w:p>
     <w:p>
@@ -1112,495 +1228,7 @@
         <w:jc w:val="both"/>
       </w:pPr>
       <w:r>
-        <w:t>读取原声音质量报告：{"allPassed": true, "simMin": 0.7306298017501831, "cerMax": 0.02857142857142857, "voice": "用户本人克隆声音 / lecture"}</w:t>
-      </w:r>
-    </w:p>
-    <w:p>
-      <w:pPr>
-        <w:jc w:val="both"/>
-      </w:pPr>
-      <w:r>
-        <w:t>原视频quality/verification.json尚未存在；等待原项目完成后读取，不把计划当完成成片。</w:t>
-      </w:r>
-    </w:p>
-    <w:p>
-      <w:pPr>
-        <w:jc w:val="both"/>
-      </w:pPr>
-      <w:r>
-        <w:t>核对段 goals，82—108秒：知识目标是理解离散对象的数量计算、数论、集合、关系、逻辑、图与代数结构。能力目标是建立模型，开展推理，实现算法并验证边界。价值目标是培养科学精神、工程责任与创新意识，让逻辑严谨表现为条件完整、证据清楚和诚实表达。</w:t>
-      </w:r>
-    </w:p>
-    <w:p>
-      <w:pPr>
-        <w:jc w:val="both"/>
-      </w:pPr>
-      <w:r>
-        <w:t>核对段 lesson，225—245秒：实施选择图的访问方法与文化遗产数字化保护，对应特殊图中的欧拉图。原教学环节为十五分钟：三分钟导入，七分钟技术讲解，四分钟讨论，一分钟小结。下面采用简化扫描路线图解释数学条件，场景和路径均为教学示意。</w:t>
-      </w:r>
-    </w:p>
-    <w:p>
-      <w:pPr>
-        <w:jc w:val="both"/>
-      </w:pPr>
-      <w:r>
-        <w:t>核对段 rubric，490—514秒：作品评价计划关注定义准确、论证完整、实现正确和应用有界。既看程序能否运行，也检查证明是否遗漏假设。让原命题不成立的例子是否有效，模型是否说明现实限制，也需要说明。量规提前公开，帮助学生把严谨要求转化为可以检查和改进的具体步骤。</w:t>
-      </w:r>
-    </w:p>
-    <w:p>
-      <w:pPr>
-        <w:pStyle w:val="Heading2"/>
-      </w:pPr>
-      <w:r>
-        <w:t>C语言程序设计</w:t>
-      </w:r>
-    </w:p>
-    <w:p>
-      <w:pPr>
-        <w:jc w:val="both"/>
-      </w:pPr>
-      <w:r>
-        <w:t>计划：C:\Users\谢鑫\Documents\Codex\2026-10-10\files-pasted-by-the-user-3\outputs\course_series_10\assets\c\plan600.json</w:t>
-      </w:r>
-    </w:p>
-    <w:p>
-      <w:pPr>
-        <w:jc w:val="both"/>
-      </w:pPr>
-      <w:r>
-        <w:t>场景数：27；0—600秒连续性：True。</w:t>
-      </w:r>
-    </w:p>
-    <w:p>
-      <w:pPr>
-        <w:jc w:val="both"/>
-      </w:pPr>
-      <w:r>
-        <w:t>成片：C:\Users\谢鑫\Documents\Codex\2026-10-10\files-pasted-by-the-user-3\outputs\course_series_10\final\C语言程序设计_10分钟说课_本人配音.mp4；核对时存在：True。</w:t>
-      </w:r>
-    </w:p>
-    <w:p>
-      <w:pPr>
-        <w:jc w:val="both"/>
-      </w:pPr>
-      <w:r>
-        <w:t>本轮ffprobe：{"programs": [], "stream_groups": [], "streams": [{"codec_name": "h264", "codec_type": "video", "width": 1920, "height": 1080, "avg_frame_rate": "30/1"}, {"codec_name": "aac", "codec_type": "audio", "avg_frame_rate": "0/0"}], "format": {"duration": "600.000000"}}</w:t>
-      </w:r>
-    </w:p>
-    <w:p>
-      <w:pPr>
-        <w:jc w:val="both"/>
-      </w:pPr>
-      <w:r>
-        <w:t>读取原声音质量报告：{"allPassed": true, "simMin": 0.732718825340271, "cerMax": 0.029411764705882353, "voice": "用户本人克隆声音 / lecture"}</w:t>
-      </w:r>
-    </w:p>
-    <w:p>
-      <w:pPr>
-        <w:jc w:val="both"/>
-      </w:pPr>
-      <w:r>
-        <w:t>读取原视频质量报告：{"duration": 600.0, "fullDecode": true, "subtitlesVerified": true}</w:t>
-      </w:r>
-    </w:p>
-    <w:p>
-      <w:pPr>
-        <w:jc w:val="both"/>
-      </w:pPr>
-      <w:r>
-        <w:t>核对段 goals，82—108秒：知识目标是理解类型、控制结构、函数、指针与文件等基本机制。能力目标是把需求分解为可实现的模块，完成编码、调试与测试。育人目标是重视安全、质量和协作责任。三个目标共同落到可解释的代码、有效的测试记录和清晰的设计说明。</w:t>
-      </w:r>
-    </w:p>
-    <w:p>
-      <w:pPr>
-        <w:jc w:val="both"/>
-      </w:pPr>
-      <w:r>
-        <w:t>核对段 lesson，225—245秒：以下选择原案例四，指针与内存管理的工匠精神。原设计为十五分钟：导入三分钟、技术七分钟、讨论四分钟、小结一分钟。教学围绕申请、使用和释放展开，让学生理解资源责任，将严谨落实到检查。</w:t>
-      </w:r>
-    </w:p>
-    <w:p>
-      <w:pPr>
-        <w:jc w:val="both"/>
-      </w:pPr>
-      <w:r>
-        <w:t>核对段 rubric，490—514秒：教学评价计划围绕四项标准展开：需求分解、机制解释、异常验证和修改记录。基础达标强调完成可靠的小任务，进阶表现强调迁移与解释。评价看成果与证据，具体权重依据学校课程要求确定，视频不预设已执行成绩或教学效果。</w:t>
-      </w:r>
-    </w:p>
-    <w:p>
-      <w:pPr>
-        <w:pStyle w:val="Heading2"/>
-      </w:pPr>
-      <w:r>
-        <w:t>网络安全技术</w:t>
-      </w:r>
-    </w:p>
-    <w:p>
-      <w:pPr>
-        <w:jc w:val="both"/>
-      </w:pPr>
-      <w:r>
-        <w:t>计划：C:\Users\谢鑫\Documents\Codex\2026-10-10\files-pasted-by-the-user-3\outputs\course_series_10\assets\security\plan600.json</w:t>
-      </w:r>
-    </w:p>
-    <w:p>
-      <w:pPr>
-        <w:jc w:val="both"/>
-      </w:pPr>
-      <w:r>
-        <w:t>场景数：27；0—600秒连续性：True。</w:t>
-      </w:r>
-    </w:p>
-    <w:p>
-      <w:pPr>
-        <w:jc w:val="both"/>
-      </w:pPr>
-      <w:r>
-        <w:t>成片：C:\Users\谢鑫\Documents\Codex\2026-10-10\files-pasted-by-the-user-3\outputs\course_series_10\final\网络安全技术_10分钟说课_本人配音.mp4；核对时存在：True。</w:t>
-      </w:r>
-    </w:p>
-    <w:p>
-      <w:pPr>
-        <w:jc w:val="both"/>
-      </w:pPr>
-      <w:r>
-        <w:t>本轮ffprobe：{"programs": [], "stream_groups": [], "streams": [{"codec_name": "h264", "codec_type": "video", "width": 1920, "height": 1080, "avg_frame_rate": "30/1"}, {"codec_name": "aac", "codec_type": "audio", "avg_frame_rate": "0/0"}], "format": {"duration": "600.000000"}}</w:t>
-      </w:r>
-    </w:p>
-    <w:p>
-      <w:pPr>
-        <w:jc w:val="both"/>
-      </w:pPr>
-      <w:r>
-        <w:t>读取原声音质量报告：{"allPassed": true, "simMin": 0.7313821315765381, "cerMax": 0.029411764705882353, "voice": "用户本人克隆声音 / lecture"}</w:t>
-      </w:r>
-    </w:p>
-    <w:p>
-      <w:pPr>
-        <w:jc w:val="both"/>
-      </w:pPr>
-      <w:r>
-        <w:t>读取原视频质量报告：{"duration": 600.0, "fullDecode": true, "subtitlesVerified": true}</w:t>
-      </w:r>
-    </w:p>
-    <w:p>
-      <w:pPr>
-        <w:jc w:val="both"/>
-      </w:pPr>
-      <w:r>
-        <w:t>核对段 goals，82—108秒：知识目标是理解恶意代码、攻击原理、访问控制、加密、系统和应用安全。能力目标是依据证据识别风险，设计防护与响应方案。育人目标是维护公共安全、尊重权利并遵守职业边界。学生通过风险图、防护设计和规范记录，展示目标达成的依据。</w:t>
-      </w:r>
-    </w:p>
-    <w:p>
-      <w:pPr>
-        <w:jc w:val="both"/>
-      </w:pPr>
-      <w:r>
-        <w:t>核对段 lesson，225—245秒：以下选择原案例十，纵深防御体系与安全责任落实。原设计为十二分钟：导入两分钟、技术五分钟、思政融入四分钟、实践一分钟。课堂追问已有防护为何仍可能失守，从单点措施走向技术、管理和人员协同防护。</w:t>
-      </w:r>
-    </w:p>
-    <w:p>
-      <w:pPr>
-        <w:jc w:val="both"/>
-      </w:pPr>
-      <w:r>
-        <w:t>核对段 rubric，490—514秒：量规拟设置机制准确、措施合理、边界清楚和记录完整四项。基础达标解释风险并提出对应防护；进阶表现考虑措施失效、业务影响与协作。评价依据成果与论证，权重结合课程要求确定，不预设已取得成效。</w:t>
-      </w:r>
-    </w:p>
-    <w:p>
-      <w:pPr>
-        <w:pStyle w:val="Heading2"/>
-      </w:pPr>
-      <w:r>
-        <w:t>嵌入式系统</w:t>
-      </w:r>
-    </w:p>
-    <w:p>
-      <w:pPr>
-        <w:jc w:val="both"/>
-      </w:pPr>
-      <w:r>
-        <w:t>计划：C:\Users\谢鑫\Documents\Codex\2026-10-10\files-pasted-by-the-user-3\outputs\course_series_10\assets\embedded\plan600.json</w:t>
-      </w:r>
-    </w:p>
-    <w:p>
-      <w:pPr>
-        <w:jc w:val="both"/>
-      </w:pPr>
-      <w:r>
-        <w:t>场景数：27；0—600秒连续性：True。</w:t>
-      </w:r>
-    </w:p>
-    <w:p>
-      <w:pPr>
-        <w:jc w:val="both"/>
-      </w:pPr>
-      <w:r>
-        <w:t>成片：C:\Users\谢鑫\Documents\Codex\2026-10-10\files-pasted-by-the-user-3\outputs\course_series_10\final\嵌入式系统教程_10分钟说课_本人配音.mp4；核对时存在：True。</w:t>
-      </w:r>
-    </w:p>
-    <w:p>
-      <w:pPr>
-        <w:jc w:val="both"/>
-      </w:pPr>
-      <w:r>
-        <w:t>本轮ffprobe：{"programs": [], "stream_groups": [], "streams": [{"codec_name": "h264", "codec_type": "video", "width": 1920, "height": 1080, "avg_frame_rate": "30/1"}, {"codec_name": "aac", "codec_type": "audio", "avg_frame_rate": "0/0"}], "format": {"duration": "600.000000"}}</w:t>
-      </w:r>
-    </w:p>
-    <w:p>
-      <w:pPr>
-        <w:jc w:val="both"/>
-      </w:pPr>
-      <w:r>
-        <w:t>读取原声音质量报告：{"allPassed": true, "simMin": 0.7342575192451477, "cerMax": 0.029411764705882353, "voice": "用户本人克隆声音 / lecture"}</w:t>
-      </w:r>
-    </w:p>
-    <w:p>
-      <w:pPr>
-        <w:jc w:val="both"/>
-      </w:pPr>
-      <w:r>
-        <w:t>读取原视频质量报告：{"duration": 600.0, "fullDecode": true, "subtitlesVerified": true}</w:t>
-      </w:r>
-    </w:p>
-    <w:p>
-      <w:pPr>
-        <w:jc w:val="both"/>
-      </w:pPr>
-      <w:r>
-        <w:t>核对段 goals，82—108秒：知识目标是理解ARM架构、Linux内核、驱动结构、移植与应用。能力目标是构建开发环境，编写设备驱动，分析时序并完成边界测试。价值目标是在自主创新、开源协作和设备安全中，形成科学精神、创新意识与职业责任。</w:t>
-      </w:r>
-    </w:p>
-    <w:p>
-      <w:pPr>
-        <w:jc w:val="both"/>
-      </w:pPr>
-      <w:r>
-        <w:t>核对段 lesson，225—245秒：课堂实施选用工业物联网与智能制造中的嵌入式安全，对应Linux设备驱动结构。原教学设计为十五分钟：三分钟导入，七分钟技术讲解，四分钟讨论，一分钟小结。下面展开的是这段课堂设计，完整说课视频时长为十分钟。</w:t>
-      </w:r>
-    </w:p>
-    <w:p>
-      <w:pPr>
-        <w:jc w:val="both"/>
-      </w:pPr>
-      <w:r>
-        <w:t>核对段 rubric，490—514秒：作品评价计划关注四个方面：接口与功能是否正确，异常处理是否完整，测试是否覆盖边界，文档是否说明责任和限制。能够运行是起点，能够解释和验证是进一步要求。评分规则提前公开，帮助学生把质量要求转化为具体行动。</w:t>
-      </w:r>
-    </w:p>
-    <w:p>
-      <w:pPr>
-        <w:pStyle w:val="Heading2"/>
-      </w:pPr>
-      <w:r>
-        <w:t>数据挖掘</w:t>
-      </w:r>
-    </w:p>
-    <w:p>
-      <w:pPr>
-        <w:jc w:val="both"/>
-      </w:pPr>
-      <w:r>
-        <w:t>计划：C:\Users\谢鑫\Documents\Codex\2026-10-10\files-pasted-by-the-user-3\outputs\course_series_10\assets\mining\plan600.json</w:t>
-      </w:r>
-    </w:p>
-    <w:p>
-      <w:pPr>
-        <w:jc w:val="both"/>
-      </w:pPr>
-      <w:r>
-        <w:t>场景数：27；0—600秒连续性：True。</w:t>
-      </w:r>
-    </w:p>
-    <w:p>
-      <w:pPr>
-        <w:jc w:val="both"/>
-      </w:pPr>
-      <w:r>
-        <w:t>成片：C:\Users\谢鑫\Documents\Codex\2026-10-10\files-pasted-by-the-user-3\outputs\course_series_10\final\数据挖掘_10分钟说课_本人配音.mp4；核对时存在：True。</w:t>
-      </w:r>
-    </w:p>
-    <w:p>
-      <w:pPr>
-        <w:jc w:val="both"/>
-      </w:pPr>
-      <w:r>
-        <w:t>本轮ffprobe：{"programs": [], "stream_groups": [], "streams": [{"codec_name": "h264", "codec_type": "video", "width": 1920, "height": 1080, "avg_frame_rate": "30/1"}, {"codec_name": "aac", "codec_type": "audio", "avg_frame_rate": "0/0"}], "format": {"duration": "600.000000"}}</w:t>
-      </w:r>
-    </w:p>
-    <w:p>
-      <w:pPr>
-        <w:jc w:val="both"/>
-      </w:pPr>
-      <w:r>
-        <w:t>读取原声音质量报告：{"allPassed": true, "simMin": 0.7431703209877014, "cerMax": 0.029411764705882353, "voice": "用户本人克隆声音 / lecture"}</w:t>
-      </w:r>
-    </w:p>
-    <w:p>
-      <w:pPr>
-        <w:jc w:val="both"/>
-      </w:pPr>
-      <w:r>
-        <w:t>读取原视频质量报告：{"duration": 600.0, "fullDecode": true, "subtitlesVerified": true}</w:t>
-      </w:r>
-    </w:p>
-    <w:p>
-      <w:pPr>
-        <w:jc w:val="both"/>
-      </w:pPr>
-      <w:r>
-        <w:t>核对段 goals，82—108秒：知识目标是理解知识发现流程与聚类、分类、关联、回归和离群检测。能力目标是完成数据准备、模型比较、评价与解释。价值目标是关注数据安全、科学严谨与算法公平，把数据向善落实为问题定义和结果使用的具体要求。</w:t>
-      </w:r>
-    </w:p>
-    <w:p>
-      <w:pPr>
-        <w:jc w:val="both"/>
-      </w:pPr>
-      <w:r>
-        <w:t>核对段 lesson，225—245秒：实施选用AI招聘算法中的公平性问题，对应分类分析中的近邻算法。原教学设计为十二分钟：两分钟导入，五分钟技术讲解，四分钟思政融入，一分钟互动。课堂围绕一个问题展开：模型表现好，是否就足以支持招聘决策？</w:t>
-      </w:r>
-    </w:p>
-    <w:p>
-      <w:pPr>
-        <w:jc w:val="both"/>
-      </w:pPr>
-      <w:r>
-        <w:t>核对段 rubric，490—514秒：作品评价计划关注技术适配、证据完整、责任判断与表达清晰。既检查算法和指标是否用对，也检查数据划分、误差分析与限制说明。好的报告应让读者理解结论成立的条件，知道哪些问题仍需核查，而不只看到一个漂亮数字。</w:t>
-      </w:r>
-    </w:p>
-    <w:p>
-      <w:pPr>
-        <w:pStyle w:val="Heading2"/>
-      </w:pPr>
-      <w:r>
-        <w:t>AI工程概览</w:t>
-      </w:r>
-    </w:p>
-    <w:p>
-      <w:pPr>
-        <w:jc w:val="both"/>
-      </w:pPr>
-      <w:r>
-        <w:t>计划：C:\Users\谢鑫\Documents\Codex\2026-10-10\files-pasted-by-the-user-3\outputs\course_series_10\assets\ai\plan600.json</w:t>
-      </w:r>
-    </w:p>
-    <w:p>
-      <w:pPr>
-        <w:jc w:val="both"/>
-      </w:pPr>
-      <w:r>
-        <w:t>场景数：27；0—600秒连续性：True。</w:t>
-      </w:r>
-    </w:p>
-    <w:p>
-      <w:pPr>
-        <w:jc w:val="both"/>
-      </w:pPr>
-      <w:r>
-        <w:t>成片：C:\Users\谢鑫\Documents\Codex\2026-10-10\files-pasted-by-the-user-3\outputs\course_series_10\final\AI工程概览_10分钟说课_本人配音.mp4；核对时存在：True。</w:t>
-      </w:r>
-    </w:p>
-    <w:p>
-      <w:pPr>
-        <w:jc w:val="both"/>
-      </w:pPr>
-      <w:r>
-        <w:t>关联project的courses.json当前未含该课程键；已从独立assets计划读取目标、案例和评价。不能声称统一项目已含全部十门。</w:t>
-      </w:r>
-    </w:p>
-    <w:p>
-      <w:pPr>
-        <w:jc w:val="both"/>
-      </w:pPr>
-      <w:r>
-        <w:t>本轮ffprobe：{"programs": [], "stream_groups": [], "streams": [{"codec_name": "h264", "codec_type": "video", "width": 1920, "height": 1080, "avg_frame_rate": "30/1"}, {"codec_name": "aac", "codec_type": "audio", "avg_frame_rate": "0/0"}], "format": {"duration": "600.000000"}}</w:t>
-      </w:r>
-    </w:p>
-    <w:p>
-      <w:pPr>
-        <w:jc w:val="both"/>
-      </w:pPr>
-      <w:r>
-        <w:t>读取原声音质量报告：{"allPassed": true, "simMin": 0.7263849973678589, "cerMax": 0.02702702702702703, "voice": "用户本人克隆声音 / lecture"}</w:t>
-      </w:r>
-    </w:p>
-    <w:p>
-      <w:pPr>
-        <w:jc w:val="both"/>
-      </w:pPr>
-      <w:r>
-        <w:t>读取原视频质量报告：{"duration": 600.0, "fullDecode": true, "subtitlesVerified": true}</w:t>
-      </w:r>
-    </w:p>
-    <w:p>
-      <w:pPr>
-        <w:jc w:val="both"/>
-      </w:pPr>
-      <w:r>
-        <w:t>核对段 goals，82—108秒：教学目标有三个层面。知识目标，是理解基础模型、评估、提示、检索、微调和优化的基本逻辑。能力目标，是构建应用、设计测试、追溯来源并改进方案。价值目标，是在数据使用、安全防护与技术服务中，形成科学精神、职业伦理和社会责任意识。</w:t>
-      </w:r>
-    </w:p>
-    <w:p>
-      <w:pPr>
-        <w:jc w:val="both"/>
-      </w:pPr>
-      <w:r>
-        <w:t>核对段 lesson，225—245秒：以AI幻觉与责任边界说明课堂实施。案例串联采样机制、知识检索与人工核查。十五分钟片段分为四步：三分钟导入、七分钟技术讲解、四分钟讨论、一分钟小结。课后通过问答系统构建与对比验证，继续延伸实践。</w:t>
-      </w:r>
-    </w:p>
-    <w:p>
-      <w:pPr>
-        <w:jc w:val="both"/>
-      </w:pPr>
-      <w:r>
-        <w:t>核对段 rubric，490—514秒：标准强调可观察性。可靠性，看问题与证据是否一致；工程性，看代码、测试和记录是否完整；责任性，看授权、拒答与复核是否有依据；表达性，看取舍是否说清楚。一次生成正确，不能代表全部成绩。模拟实验的得分，也不能代表真实的学习成效。</w:t>
-      </w:r>
-    </w:p>
-    <w:p>
-      <w:pPr>
-        <w:pStyle w:val="Heading1"/>
-      </w:pPr>
-      <w:r>
-        <w:t>AI专业定位必须处理的差异</w:t>
-      </w:r>
-    </w:p>
-    <w:p>
-      <w:pPr>
-        <w:jc w:val="both"/>
-      </w:pPr>
-      <w:r>
-        <w:t>AI影片18—40秒identity段明确说“面向区块链工程专业”。本包由于原五份教师案例字段相互冲突、正式培养方案和补充专业内容未提供，采用“候选映射、待负责人确认”。保留原影片时应明确其原稿来源与映射未确认，不能把该句作为覆盖已达成证据；正式采用前优先修订该段本人配音、字幕和画面，或在得到正式专业依据后重新核对。仅添加小字不足以使相反的声音陈述一致。</w:t>
-      </w:r>
-    </w:p>
-    <w:p>
-      <w:pPr>
-        <w:jc w:val="both"/>
-      </w:pPr>
-      <w:r>
-        <w:t>技术内容包括幻觉、检索、拒答和人工核查与本包目标一致，可复用其余相应部分。链上摘要追溯不证明原文真伪；智能合约审计仍需要独立的代码、测试和负责人确认。</w:t>
-      </w:r>
-    </w:p>
-    <w:p>
-      <w:pPr>
-        <w:pStyle w:val="Heading1"/>
-      </w:pPr>
-      <w:r>
-        <w:t>本包新增内容怎样随片交付</w:t>
-      </w:r>
-    </w:p>
-    <w:p>
-      <w:pPr>
-        <w:jc w:val="both"/>
-      </w:pPr>
-      <w:r>
-        <w:t>影片已讲述的定性评价与本包新增一百分量规原则一致，但没有说明本包确切权重；以随片完整教学设计说明权重为新送审设计。六十四学时为本包建议安排，未获得正式大纲确认前不修改影片为“已执行课时”。本包四例与原稿完整案例库属于不同资源层级，不能把影片展示的原案例总数计为本包新增24例。</w:t>
-      </w:r>
-    </w:p>
-    <w:p>
-      <w:pPr>
-        <w:jc w:val="both"/>
-      </w:pPr>
-      <w:r>
-        <w:t>复用已通过本人声音核验的成片可以避免重复配音与渲染。新十二场景稿只在确需统一本包新设计、原片不适用或定位必须修改时启用，声音须沿用用户要求的Spark本人克隆声音。</w:t>
+        <w:t>教师自检后，依次执行专业初审、思政审核、学院评审委员会审定。签字、正式认定及真实课堂记录不由技术核验自动填写。</w:t>
       </w:r>
     </w:p>
     <w:sectPr>

</xml_diff>